<commit_message>
Relatório: menciona GitHub Codespaces como alternativa de instalação
Acrescenta um item aos pré-requisitos (seção 2.1) informando que o
projeto também roda num GitHub Codespace deste repositório (feature
docker-outside-of-docker, já configurada em .devcontainer), testado
e validado com o mesmo ./scripts/validar.sh. Sem outras mudanças no
conteúdo do relatório.
</commit_message>
<xml_diff>
--- a/1_Relatorio_Trabalho1.docx
+++ b/1_Relatorio_Trabalho1.docx
@@ -244,6 +244,24 @@
           <w:szCs w:val="20"/>
         </w:rPr>
         <w:t xml:space="preserve">Não é necessário instalar Java nem Maven: a compilação acontece dentro do Docker.</w:t>
+      </w:r>
+    </w:p>
+    <w:p>
+      <w:pPr>
+        <w:pStyle w:val="ListParagraph"/>
+        <w:numPr>
+          <w:ilvl w:val="0"/>
+          <w:numId w:val="2"/>
+        </w:numPr>
+        <w:spacing w:after="80" w:line="300"/>
+      </w:pPr>
+      <w:r>
+        <w:rPr>
+          <w:rFonts w:ascii="Arial" w:cs="Arial" w:eastAsia="Arial" w:hAnsi="Arial"/>
+          <w:sz w:val="20"/>
+          <w:szCs w:val="20"/>
+        </w:rPr>
+        <w:t xml:space="preserve">Alternativa sem instalar nada localmente: o projeto também roda num GitHub Codespace deste repositório (usa a feature docker-outside-of-docker, já configurada em .devcontainer/devcontainer.json) — testado e validado com o mesmo ./scripts/validar.sh.</w:t>
       </w:r>
     </w:p>
     <w:p>

</xml_diff>